<commit_message>
force scrollbar always visible on scorecard tables
</commit_message>
<xml_diff>
--- a/Project Documents files downloads/Wolf_Golf_Game_Rules and program specifications 2026.docx
+++ b/Project Documents files downloads/Wolf_Golf_Game_Rules and program specifications 2026.docx
@@ -169,15 +169,7 @@
         <w:spacing w:before="60" w:after="100"/>
       </w:pPr>
       <w:r>
-        <w:t xml:space="preserve">The group must establish the tee-shot hitting order for hole 1. This order is fixed for the entire round and rotates one position each hole (see Section 4). The program should let players drag/reorder a list of names or </w:t>
-      </w:r>
-      <w:proofErr w:type="gramStart"/>
-      <w:r>
-        <w:t>tap</w:t>
-      </w:r>
-      <w:proofErr w:type="gramEnd"/>
-      <w:r>
-        <w:t xml:space="preserve"> to assign positions 1 through 5.</w:t>
+        <w:t>The group must establish the tee-shot hitting order for hole 1. This order is fixed for the entire round and rotates one position each hole (see Section 4). The program should let players drag/reorder a list of names or tap to assign positions 1 through 5.</w:t>
       </w:r>
     </w:p>
     <w:p>
@@ -303,12 +295,6 @@
         <w:gridCol w:w="5880"/>
       </w:tblGrid>
       <w:tr>
-        <w:tblPrEx>
-          <w:tblCellMar>
-            <w:top w:w="0" w:type="dxa"/>
-            <w:bottom w:w="0" w:type="dxa"/>
-          </w:tblCellMar>
-        </w:tblPrEx>
         <w:trPr>
           <w:tblHeader/>
         </w:trPr>
@@ -404,12 +390,6 @@
         </w:tc>
       </w:tr>
       <w:tr>
-        <w:tblPrEx>
-          <w:tblCellMar>
-            <w:top w:w="0" w:type="dxa"/>
-            <w:bottom w:w="0" w:type="dxa"/>
-          </w:tblCellMar>
-        </w:tblPrEx>
         <w:tc>
           <w:tcPr>
             <w:tcW w:w="2400" w:type="dxa"/>
@@ -493,12 +473,6 @@
         </w:tc>
       </w:tr>
       <w:tr>
-        <w:tblPrEx>
-          <w:tblCellMar>
-            <w:top w:w="0" w:type="dxa"/>
-            <w:bottom w:w="0" w:type="dxa"/>
-          </w:tblCellMar>
-        </w:tblPrEx>
         <w:tc>
           <w:tcPr>
             <w:tcW w:w="2400" w:type="dxa"/>
@@ -582,12 +556,6 @@
         </w:tc>
       </w:tr>
       <w:tr>
-        <w:tblPrEx>
-          <w:tblCellMar>
-            <w:top w:w="0" w:type="dxa"/>
-            <w:bottom w:w="0" w:type="dxa"/>
-          </w:tblCellMar>
-        </w:tblPrEx>
         <w:tc>
           <w:tcPr>
             <w:tcW w:w="2400" w:type="dxa"/>
@@ -671,12 +639,6 @@
         </w:tc>
       </w:tr>
       <w:tr>
-        <w:tblPrEx>
-          <w:tblCellMar>
-            <w:top w:w="0" w:type="dxa"/>
-            <w:bottom w:w="0" w:type="dxa"/>
-          </w:tblCellMar>
-        </w:tblPrEx>
         <w:tc>
           <w:tcPr>
             <w:tcW w:w="2400" w:type="dxa"/>
@@ -760,12 +722,6 @@
         </w:tc>
       </w:tr>
       <w:tr>
-        <w:tblPrEx>
-          <w:tblCellMar>
-            <w:top w:w="0" w:type="dxa"/>
-            <w:bottom w:w="0" w:type="dxa"/>
-          </w:tblCellMar>
-        </w:tblPrEx>
         <w:tc>
           <w:tcPr>
             <w:tcW w:w="2400" w:type="dxa"/>
@@ -849,12 +805,6 @@
         </w:tc>
       </w:tr>
       <w:tr>
-        <w:tblPrEx>
-          <w:tblCellMar>
-            <w:top w:w="0" w:type="dxa"/>
-            <w:bottom w:w="0" w:type="dxa"/>
-          </w:tblCellMar>
-        </w:tblPrEx>
         <w:tc>
           <w:tcPr>
             <w:tcW w:w="2400" w:type="dxa"/>
@@ -1014,12 +964,6 @@
         <w:gridCol w:w="3600"/>
       </w:tblGrid>
       <w:tr>
-        <w:tblPrEx>
-          <w:tblCellMar>
-            <w:top w:w="0" w:type="dxa"/>
-            <w:bottom w:w="0" w:type="dxa"/>
-          </w:tblCellMar>
-        </w:tblPrEx>
         <w:trPr>
           <w:tblHeader/>
         </w:trPr>
@@ -1116,12 +1060,6 @@
         </w:tc>
       </w:tr>
       <w:tr>
-        <w:tblPrEx>
-          <w:tblCellMar>
-            <w:top w:w="0" w:type="dxa"/>
-            <w:bottom w:w="0" w:type="dxa"/>
-          </w:tblCellMar>
-        </w:tblPrEx>
         <w:tc>
           <w:tcPr>
             <w:tcW w:w="1440" w:type="dxa"/>
@@ -1205,12 +1143,6 @@
         </w:tc>
       </w:tr>
       <w:tr>
-        <w:tblPrEx>
-          <w:tblCellMar>
-            <w:top w:w="0" w:type="dxa"/>
-            <w:bottom w:w="0" w:type="dxa"/>
-          </w:tblCellMar>
-        </w:tblPrEx>
         <w:tc>
           <w:tcPr>
             <w:tcW w:w="1440" w:type="dxa"/>
@@ -1294,12 +1226,6 @@
         </w:tc>
       </w:tr>
       <w:tr>
-        <w:tblPrEx>
-          <w:tblCellMar>
-            <w:top w:w="0" w:type="dxa"/>
-            <w:bottom w:w="0" w:type="dxa"/>
-          </w:tblCellMar>
-        </w:tblPrEx>
         <w:tc>
           <w:tcPr>
             <w:tcW w:w="1440" w:type="dxa"/>
@@ -1383,12 +1309,6 @@
         </w:tc>
       </w:tr>
       <w:tr>
-        <w:tblPrEx>
-          <w:tblCellMar>
-            <w:top w:w="0" w:type="dxa"/>
-            <w:bottom w:w="0" w:type="dxa"/>
-          </w:tblCellMar>
-        </w:tblPrEx>
         <w:tc>
           <w:tcPr>
             <w:tcW w:w="1440" w:type="dxa"/>
@@ -1472,12 +1392,6 @@
         </w:tc>
       </w:tr>
       <w:tr>
-        <w:tblPrEx>
-          <w:tblCellMar>
-            <w:top w:w="0" w:type="dxa"/>
-            <w:bottom w:w="0" w:type="dxa"/>
-          </w:tblCellMar>
-        </w:tblPrEx>
         <w:tc>
           <w:tcPr>
             <w:tcW w:w="1440" w:type="dxa"/>
@@ -1561,12 +1475,6 @@
         </w:tc>
       </w:tr>
       <w:tr>
-        <w:tblPrEx>
-          <w:tblCellMar>
-            <w:top w:w="0" w:type="dxa"/>
-            <w:bottom w:w="0" w:type="dxa"/>
-          </w:tblCellMar>
-        </w:tblPrEx>
         <w:tc>
           <w:tcPr>
             <w:tcW w:w="1440" w:type="dxa"/>
@@ -1650,12 +1558,6 @@
         </w:tc>
       </w:tr>
       <w:tr>
-        <w:tblPrEx>
-          <w:tblCellMar>
-            <w:top w:w="0" w:type="dxa"/>
-            <w:bottom w:w="0" w:type="dxa"/>
-          </w:tblCellMar>
-        </w:tblPrEx>
         <w:tc>
           <w:tcPr>
             <w:tcW w:w="1440" w:type="dxa"/>
@@ -1739,12 +1641,6 @@
         </w:tc>
       </w:tr>
       <w:tr>
-        <w:tblPrEx>
-          <w:tblCellMar>
-            <w:top w:w="0" w:type="dxa"/>
-            <w:bottom w:w="0" w:type="dxa"/>
-          </w:tblCellMar>
-        </w:tblPrEx>
         <w:tc>
           <w:tcPr>
             <w:tcW w:w="1440" w:type="dxa"/>
@@ -1828,12 +1724,6 @@
         </w:tc>
       </w:tr>
       <w:tr>
-        <w:tblPrEx>
-          <w:tblCellMar>
-            <w:top w:w="0" w:type="dxa"/>
-            <w:bottom w:w="0" w:type="dxa"/>
-          </w:tblCellMar>
-        </w:tblPrEx>
         <w:tc>
           <w:tcPr>
             <w:tcW w:w="1440" w:type="dxa"/>
@@ -2395,12 +2285,6 @@
         <w:gridCol w:w="3120"/>
       </w:tblGrid>
       <w:tr>
-        <w:tblPrEx>
-          <w:tblCellMar>
-            <w:top w:w="0" w:type="dxa"/>
-            <w:bottom w:w="0" w:type="dxa"/>
-          </w:tblCellMar>
-        </w:tblPrEx>
         <w:trPr>
           <w:tblHeader/>
         </w:trPr>
@@ -2496,12 +2380,6 @@
         </w:tc>
       </w:tr>
       <w:tr>
-        <w:tblPrEx>
-          <w:tblCellMar>
-            <w:top w:w="0" w:type="dxa"/>
-            <w:bottom w:w="0" w:type="dxa"/>
-          </w:tblCellMar>
-        </w:tblPrEx>
         <w:tc>
           <w:tcPr>
             <w:tcW w:w="3120" w:type="dxa"/>
@@ -2585,12 +2463,6 @@
         </w:tc>
       </w:tr>
       <w:tr>
-        <w:tblPrEx>
-          <w:tblCellMar>
-            <w:top w:w="0" w:type="dxa"/>
-            <w:bottom w:w="0" w:type="dxa"/>
-          </w:tblCellMar>
-        </w:tblPrEx>
         <w:tc>
           <w:tcPr>
             <w:tcW w:w="3120" w:type="dxa"/>
@@ -2674,12 +2546,6 @@
         </w:tc>
       </w:tr>
       <w:tr>
-        <w:tblPrEx>
-          <w:tblCellMar>
-            <w:top w:w="0" w:type="dxa"/>
-            <w:bottom w:w="0" w:type="dxa"/>
-          </w:tblCellMar>
-        </w:tblPrEx>
         <w:tc>
           <w:tcPr>
             <w:tcW w:w="3120" w:type="dxa"/>
@@ -2805,12 +2671,6 @@
         <w:gridCol w:w="3120"/>
       </w:tblGrid>
       <w:tr>
-        <w:tblPrEx>
-          <w:tblCellMar>
-            <w:top w:w="0" w:type="dxa"/>
-            <w:bottom w:w="0" w:type="dxa"/>
-          </w:tblCellMar>
-        </w:tblPrEx>
         <w:trPr>
           <w:tblHeader/>
         </w:trPr>
@@ -2906,12 +2766,6 @@
         </w:tc>
       </w:tr>
       <w:tr>
-        <w:tblPrEx>
-          <w:tblCellMar>
-            <w:top w:w="0" w:type="dxa"/>
-            <w:bottom w:w="0" w:type="dxa"/>
-          </w:tblCellMar>
-        </w:tblPrEx>
         <w:tc>
           <w:tcPr>
             <w:tcW w:w="3600" w:type="dxa"/>
@@ -2995,12 +2849,6 @@
         </w:tc>
       </w:tr>
       <w:tr>
-        <w:tblPrEx>
-          <w:tblCellMar>
-            <w:top w:w="0" w:type="dxa"/>
-            <w:bottom w:w="0" w:type="dxa"/>
-          </w:tblCellMar>
-        </w:tblPrEx>
         <w:tc>
           <w:tcPr>
             <w:tcW w:w="3600" w:type="dxa"/>
@@ -3084,12 +2932,6 @@
         </w:tc>
       </w:tr>
       <w:tr>
-        <w:tblPrEx>
-          <w:tblCellMar>
-            <w:top w:w="0" w:type="dxa"/>
-            <w:bottom w:w="0" w:type="dxa"/>
-          </w:tblCellMar>
-        </w:tblPrEx>
         <w:tc>
           <w:tcPr>
             <w:tcW w:w="3600" w:type="dxa"/>
@@ -3214,12 +3056,6 @@
         <w:gridCol w:w="3120"/>
       </w:tblGrid>
       <w:tr>
-        <w:tblPrEx>
-          <w:tblCellMar>
-            <w:top w:w="0" w:type="dxa"/>
-            <w:bottom w:w="0" w:type="dxa"/>
-          </w:tblCellMar>
-        </w:tblPrEx>
         <w:trPr>
           <w:tblHeader/>
         </w:trPr>
@@ -3315,12 +3151,6 @@
         </w:tc>
       </w:tr>
       <w:tr>
-        <w:tblPrEx>
-          <w:tblCellMar>
-            <w:top w:w="0" w:type="dxa"/>
-            <w:bottom w:w="0" w:type="dxa"/>
-          </w:tblCellMar>
-        </w:tblPrEx>
         <w:tc>
           <w:tcPr>
             <w:tcW w:w="3600" w:type="dxa"/>
@@ -3404,12 +3234,6 @@
         </w:tc>
       </w:tr>
       <w:tr>
-        <w:tblPrEx>
-          <w:tblCellMar>
-            <w:top w:w="0" w:type="dxa"/>
-            <w:bottom w:w="0" w:type="dxa"/>
-          </w:tblCellMar>
-        </w:tblPrEx>
         <w:tc>
           <w:tcPr>
             <w:tcW w:w="3600" w:type="dxa"/>
@@ -3493,12 +3317,6 @@
         </w:tc>
       </w:tr>
       <w:tr>
-        <w:tblPrEx>
-          <w:tblCellMar>
-            <w:top w:w="0" w:type="dxa"/>
-            <w:bottom w:w="0" w:type="dxa"/>
-          </w:tblCellMar>
-        </w:tblPrEx>
         <w:tc>
           <w:tcPr>
             <w:tcW w:w="3600" w:type="dxa"/>
@@ -3758,6 +3576,9 @@
       <w:pPr>
         <w:spacing w:before="80"/>
       </w:pPr>
+      <w:r>
+        <w:t>carry</w:t>
+      </w:r>
     </w:p>
     <w:tbl>
       <w:tblPr>
@@ -3783,12 +3604,6 @@
         <w:gridCol w:w="2040"/>
       </w:tblGrid>
       <w:tr>
-        <w:tblPrEx>
-          <w:tblCellMar>
-            <w:top w:w="0" w:type="dxa"/>
-            <w:bottom w:w="0" w:type="dxa"/>
-          </w:tblCellMar>
-        </w:tblPrEx>
         <w:trPr>
           <w:tblHeader/>
         </w:trPr>
@@ -3914,12 +3729,6 @@
         </w:tc>
       </w:tr>
       <w:tr>
-        <w:tblPrEx>
-          <w:tblCellMar>
-            <w:top w:w="0" w:type="dxa"/>
-            <w:bottom w:w="0" w:type="dxa"/>
-          </w:tblCellMar>
-        </w:tblPrEx>
         <w:tc>
           <w:tcPr>
             <w:tcW w:w="3000" w:type="dxa"/>
@@ -4030,12 +3839,6 @@
         </w:tc>
       </w:tr>
       <w:tr>
-        <w:tblPrEx>
-          <w:tblCellMar>
-            <w:top w:w="0" w:type="dxa"/>
-            <w:bottom w:w="0" w:type="dxa"/>
-          </w:tblCellMar>
-        </w:tblPrEx>
         <w:tc>
           <w:tcPr>
             <w:tcW w:w="3000" w:type="dxa"/>
@@ -4146,12 +3949,6 @@
         </w:tc>
       </w:tr>
       <w:tr>
-        <w:tblPrEx>
-          <w:tblCellMar>
-            <w:top w:w="0" w:type="dxa"/>
-            <w:bottom w:w="0" w:type="dxa"/>
-          </w:tblCellMar>
-        </w:tblPrEx>
         <w:tc>
           <w:tcPr>
             <w:tcW w:w="3000" w:type="dxa"/>
@@ -4262,12 +4059,6 @@
         </w:tc>
       </w:tr>
       <w:tr>
-        <w:tblPrEx>
-          <w:tblCellMar>
-            <w:top w:w="0" w:type="dxa"/>
-            <w:bottom w:w="0" w:type="dxa"/>
-          </w:tblCellMar>
-        </w:tblPrEx>
         <w:tc>
           <w:tcPr>
             <w:tcW w:w="3000" w:type="dxa"/>
@@ -4652,17 +4443,7 @@
           <w:sz w:val="20"/>
           <w:szCs w:val="20"/>
         </w:rPr>
-        <w:t>⚙</w:t>
-      </w:r>
-      <w:r>
-        <w:rPr>
-          <w:b/>
-          <w:bCs/>
-          <w:color w:val="7F6000"/>
-          <w:sz w:val="20"/>
-          <w:szCs w:val="20"/>
-        </w:rPr>
-        <w:t xml:space="preserve">  TOGGLE OPTION: Wolf Controls Tee Order on Holes 16–18</w:t>
+        <w:t>⚙  TOGGLE OPTION: Wolf Controls Tee Order on Holes 16–18</w:t>
       </w:r>
     </w:p>
     <w:p>
@@ -4830,12 +4611,6 @@
         <w:gridCol w:w="7560"/>
       </w:tblGrid>
       <w:tr>
-        <w:tblPrEx>
-          <w:tblCellMar>
-            <w:top w:w="0" w:type="dxa"/>
-            <w:bottom w:w="0" w:type="dxa"/>
-          </w:tblCellMar>
-        </w:tblPrEx>
         <w:trPr>
           <w:tblHeader/>
         </w:trPr>
@@ -4901,12 +4676,6 @@
         </w:tc>
       </w:tr>
       <w:tr>
-        <w:tblPrEx>
-          <w:tblCellMar>
-            <w:top w:w="0" w:type="dxa"/>
-            <w:bottom w:w="0" w:type="dxa"/>
-          </w:tblCellMar>
-        </w:tblPrEx>
         <w:tc>
           <w:tcPr>
             <w:tcW w:w="1800" w:type="dxa"/>
@@ -4963,12 +4732,6 @@
         </w:tc>
       </w:tr>
       <w:tr>
-        <w:tblPrEx>
-          <w:tblCellMar>
-            <w:top w:w="0" w:type="dxa"/>
-            <w:bottom w:w="0" w:type="dxa"/>
-          </w:tblCellMar>
-        </w:tblPrEx>
         <w:tc>
           <w:tcPr>
             <w:tcW w:w="1800" w:type="dxa"/>
@@ -5025,12 +4788,6 @@
         </w:tc>
       </w:tr>
       <w:tr>
-        <w:tblPrEx>
-          <w:tblCellMar>
-            <w:top w:w="0" w:type="dxa"/>
-            <w:bottom w:w="0" w:type="dxa"/>
-          </w:tblCellMar>
-        </w:tblPrEx>
         <w:tc>
           <w:tcPr>
             <w:tcW w:w="1800" w:type="dxa"/>
@@ -5087,12 +4844,6 @@
         </w:tc>
       </w:tr>
       <w:tr>
-        <w:tblPrEx>
-          <w:tblCellMar>
-            <w:top w:w="0" w:type="dxa"/>
-            <w:bottom w:w="0" w:type="dxa"/>
-          </w:tblCellMar>
-        </w:tblPrEx>
         <w:tc>
           <w:tcPr>
             <w:tcW w:w="1800" w:type="dxa"/>
@@ -5149,12 +4900,6 @@
         </w:tc>
       </w:tr>
       <w:tr>
-        <w:tblPrEx>
-          <w:tblCellMar>
-            <w:top w:w="0" w:type="dxa"/>
-            <w:bottom w:w="0" w:type="dxa"/>
-          </w:tblCellMar>
-        </w:tblPrEx>
         <w:tc>
           <w:tcPr>
             <w:tcW w:w="1800" w:type="dxa"/>
@@ -5248,17 +4993,7 @@
           <w:sz w:val="20"/>
           <w:szCs w:val="20"/>
         </w:rPr>
-        <w:t>⚙</w:t>
-      </w:r>
-      <w:r>
-        <w:rPr>
-          <w:b/>
-          <w:bCs/>
-          <w:color w:val="7F6000"/>
-          <w:sz w:val="20"/>
-          <w:szCs w:val="20"/>
-        </w:rPr>
-        <w:t xml:space="preserve">  TOGGLE OPTION: Shuck = Immediate Forced Lone Wolf</w:t>
+        <w:t>⚙  TOGGLE OPTION: Shuck = Immediate Forced Lone Wolf</w:t>
       </w:r>
     </w:p>
     <w:p>
@@ -5383,17 +5118,7 @@
           <w:sz w:val="20"/>
           <w:szCs w:val="20"/>
         </w:rPr>
-        <w:t>⚙</w:t>
-      </w:r>
-      <w:r>
-        <w:rPr>
-          <w:b/>
-          <w:bCs/>
-          <w:color w:val="7F6000"/>
-          <w:sz w:val="20"/>
-          <w:szCs w:val="20"/>
-        </w:rPr>
-        <w:t xml:space="preserve">  TOGGLE OPTION: What the program must track when Shuck toggle is OFF</w:t>
+        <w:t>⚙  TOGGLE OPTION: What the program must track when Shuck toggle is OFF</w:t>
       </w:r>
     </w:p>
     <w:p>
@@ -5573,10 +5298,7 @@
         <w:spacing w:before="60" w:after="100"/>
       </w:pPr>
       <w:r>
-        <w:t>Handicaps are required for all players (Section 3D). The program applies strokes on the correct holes per the course stroke index before comparing scores. Net score = Gross score minus strokes received on that hole. The specific stroke count per player depends on the handicap method chosen at setup: Gross Handicap (full strokes) or Net Differential Handicap (strokes relative to the lowest-handicap player). The program must store the stroke index for all 18 holes and apply the selected method automatically o</w:t>
-      </w:r>
-      <w:r>
-        <w:t>n every hole.</w:t>
+        <w:t>Handicaps are required for all players (Section 3D). The program applies strokes on the correct holes per the course stroke index before comparing scores. Net score = Gross score minus strokes received on that hole. The specific stroke count per player depends on the handicap method chosen at setup: Gross Handicap (full strokes) or Net Differential Handicap (strokes relative to the lowest-handicap player). The program must store the stroke index for all 18 holes and apply the selected method automatically on every hole.</w:t>
       </w:r>
     </w:p>
     <w:p>
@@ -5711,15 +5433,7 @@
       </w:pPr>
       <w:r>
         <w:lastRenderedPageBreak/>
-        <w:t xml:space="preserve">The current hole-by-hole log </w:t>
-      </w:r>
-      <w:proofErr w:type="gramStart"/>
-      <w:r>
-        <w:t>showing</w:t>
-      </w:r>
-      <w:proofErr w:type="gramEnd"/>
-      <w:r>
-        <w:t xml:space="preserve"> format, winner, points, and dollar swing for each completed hole.</w:t>
+        <w:t>The current hole-by-hole log showing format, winner, points, and dollar swing for each completed hole.</w:t>
       </w:r>
     </w:p>
     <w:p>
@@ -5813,15 +5527,7 @@
         <w:spacing w:before="40" w:after="40"/>
       </w:pPr>
       <w:r>
-        <w:t xml:space="preserve">Each player's current cumulative dollar </w:t>
-      </w:r>
-      <w:proofErr w:type="gramStart"/>
-      <w:r>
-        <w:t>standing</w:t>
-      </w:r>
-      <w:proofErr w:type="gramEnd"/>
-      <w:r>
-        <w:t>.</w:t>
+        <w:t>Each player's current cumulative dollar standing.</w:t>
       </w:r>
     </w:p>
     <w:p>
@@ -5932,12 +5638,6 @@
         <w:gridCol w:w="4680"/>
       </w:tblGrid>
       <w:tr>
-        <w:tblPrEx>
-          <w:tblCellMar>
-            <w:top w:w="0" w:type="dxa"/>
-            <w:bottom w:w="0" w:type="dxa"/>
-          </w:tblCellMar>
-        </w:tblPrEx>
         <w:trPr>
           <w:tblHeader/>
         </w:trPr>
@@ -6063,12 +5763,6 @@
         </w:tc>
       </w:tr>
       <w:tr>
-        <w:tblPrEx>
-          <w:tblCellMar>
-            <w:top w:w="0" w:type="dxa"/>
-            <w:bottom w:w="0" w:type="dxa"/>
-          </w:tblCellMar>
-        </w:tblPrEx>
         <w:tc>
           <w:tcPr>
             <w:tcW w:w="1800" w:type="dxa"/>
@@ -6179,12 +5873,6 @@
         </w:tc>
       </w:tr>
       <w:tr>
-        <w:tblPrEx>
-          <w:tblCellMar>
-            <w:top w:w="0" w:type="dxa"/>
-            <w:bottom w:w="0" w:type="dxa"/>
-          </w:tblCellMar>
-        </w:tblPrEx>
         <w:tc>
           <w:tcPr>
             <w:tcW w:w="1800" w:type="dxa"/>
@@ -6295,12 +5983,6 @@
         </w:tc>
       </w:tr>
       <w:tr>
-        <w:tblPrEx>
-          <w:tblCellMar>
-            <w:top w:w="0" w:type="dxa"/>
-            <w:bottom w:w="0" w:type="dxa"/>
-          </w:tblCellMar>
-        </w:tblPrEx>
         <w:tc>
           <w:tcPr>
             <w:tcW w:w="1800" w:type="dxa"/>
@@ -6411,12 +6093,6 @@
         </w:tc>
       </w:tr>
       <w:tr>
-        <w:tblPrEx>
-          <w:tblCellMar>
-            <w:top w:w="0" w:type="dxa"/>
-            <w:bottom w:w="0" w:type="dxa"/>
-          </w:tblCellMar>
-        </w:tblPrEx>
         <w:tc>
           <w:tcPr>
             <w:tcW w:w="1800" w:type="dxa"/>
@@ -6527,12 +6203,6 @@
         </w:tc>
       </w:tr>
       <w:tr>
-        <w:tblPrEx>
-          <w:tblCellMar>
-            <w:top w:w="0" w:type="dxa"/>
-            <w:bottom w:w="0" w:type="dxa"/>
-          </w:tblCellMar>
-        </w:tblPrEx>
         <w:tc>
           <w:tcPr>
             <w:tcW w:w="1800" w:type="dxa"/>
@@ -6769,12 +6439,6 @@
         <w:gridCol w:w="4963"/>
       </w:tblGrid>
       <w:tr>
-        <w:tblPrEx>
-          <w:tblCellMar>
-            <w:top w:w="0" w:type="dxa"/>
-            <w:bottom w:w="0" w:type="dxa"/>
-          </w:tblCellMar>
-        </w:tblPrEx>
         <w:trPr>
           <w:tblHeader/>
         </w:trPr>
@@ -6870,12 +6534,6 @@
         </w:tc>
       </w:tr>
       <w:tr>
-        <w:tblPrEx>
-          <w:tblCellMar>
-            <w:top w:w="0" w:type="dxa"/>
-            <w:bottom w:w="0" w:type="dxa"/>
-          </w:tblCellMar>
-        </w:tblPrEx>
         <w:tc>
           <w:tcPr>
             <w:tcW w:w="2040" w:type="dxa"/>
@@ -6959,12 +6617,6 @@
         </w:tc>
       </w:tr>
       <w:tr>
-        <w:tblPrEx>
-          <w:tblCellMar>
-            <w:top w:w="0" w:type="dxa"/>
-            <w:bottom w:w="0" w:type="dxa"/>
-          </w:tblCellMar>
-        </w:tblPrEx>
         <w:tc>
           <w:tcPr>
             <w:tcW w:w="2040" w:type="dxa"/>
@@ -7050,12 +6702,6 @@
         </w:tc>
       </w:tr>
       <w:tr>
-        <w:tblPrEx>
-          <w:tblCellMar>
-            <w:top w:w="0" w:type="dxa"/>
-            <w:bottom w:w="0" w:type="dxa"/>
-          </w:tblCellMar>
-        </w:tblPrEx>
         <w:tc>
           <w:tcPr>
             <w:tcW w:w="2040" w:type="dxa"/>
@@ -7141,12 +6787,6 @@
         </w:tc>
       </w:tr>
       <w:tr>
-        <w:tblPrEx>
-          <w:tblCellMar>
-            <w:top w:w="0" w:type="dxa"/>
-            <w:bottom w:w="0" w:type="dxa"/>
-          </w:tblCellMar>
-        </w:tblPrEx>
         <w:tc>
           <w:tcPr>
             <w:tcW w:w="2040" w:type="dxa"/>
@@ -7230,12 +6870,6 @@
         </w:tc>
       </w:tr>
       <w:tr>
-        <w:tblPrEx>
-          <w:tblCellMar>
-            <w:top w:w="0" w:type="dxa"/>
-            <w:bottom w:w="0" w:type="dxa"/>
-          </w:tblCellMar>
-        </w:tblPrEx>
         <w:tc>
           <w:tcPr>
             <w:tcW w:w="2040" w:type="dxa"/>
@@ -7337,12 +6971,6 @@
         </w:tc>
       </w:tr>
       <w:tr>
-        <w:tblPrEx>
-          <w:tblCellMar>
-            <w:top w:w="0" w:type="dxa"/>
-            <w:bottom w:w="0" w:type="dxa"/>
-          </w:tblCellMar>
-        </w:tblPrEx>
         <w:tc>
           <w:tcPr>
             <w:tcW w:w="2040" w:type="dxa"/>
@@ -7428,12 +7056,6 @@
         </w:tc>
       </w:tr>
       <w:tr>
-        <w:tblPrEx>
-          <w:tblCellMar>
-            <w:top w:w="0" w:type="dxa"/>
-            <w:bottom w:w="0" w:type="dxa"/>
-          </w:tblCellMar>
-        </w:tblPrEx>
         <w:tc>
           <w:tcPr>
             <w:tcW w:w="2040" w:type="dxa"/>
@@ -7519,12 +7141,6 @@
         </w:tc>
       </w:tr>
       <w:tr>
-        <w:tblPrEx>
-          <w:tblCellMar>
-            <w:top w:w="0" w:type="dxa"/>
-            <w:bottom w:w="0" w:type="dxa"/>
-          </w:tblCellMar>
-        </w:tblPrEx>
         <w:tc>
           <w:tcPr>
             <w:tcW w:w="2040" w:type="dxa"/>
@@ -7610,12 +7226,6 @@
         </w:tc>
       </w:tr>
       <w:tr>
-        <w:tblPrEx>
-          <w:tblCellMar>
-            <w:top w:w="0" w:type="dxa"/>
-            <w:bottom w:w="0" w:type="dxa"/>
-          </w:tblCellMar>
-        </w:tblPrEx>
         <w:tc>
           <w:tcPr>
             <w:tcW w:w="2040" w:type="dxa"/>
@@ -7701,12 +7311,6 @@
         </w:tc>
       </w:tr>
       <w:tr>
-        <w:tblPrEx>
-          <w:tblCellMar>
-            <w:top w:w="0" w:type="dxa"/>
-            <w:bottom w:w="0" w:type="dxa"/>
-          </w:tblCellMar>
-        </w:tblPrEx>
         <w:tc>
           <w:tcPr>
             <w:tcW w:w="2040" w:type="dxa"/>
@@ -7792,12 +7396,6 @@
         </w:tc>
       </w:tr>
       <w:tr>
-        <w:tblPrEx>
-          <w:tblCellMar>
-            <w:top w:w="0" w:type="dxa"/>
-            <w:bottom w:w="0" w:type="dxa"/>
-          </w:tblCellMar>
-        </w:tblPrEx>
         <w:tc>
           <w:tcPr>
             <w:tcW w:w="2040" w:type="dxa"/>
@@ -7883,12 +7481,6 @@
         </w:tc>
       </w:tr>
       <w:tr>
-        <w:tblPrEx>
-          <w:tblCellMar>
-            <w:top w:w="0" w:type="dxa"/>
-            <w:bottom w:w="0" w:type="dxa"/>
-          </w:tblCellMar>
-        </w:tblPrEx>
         <w:tc>
           <w:tcPr>
             <w:tcW w:w="2040" w:type="dxa"/>
@@ -7981,12 +7573,6 @@
         </w:tc>
       </w:tr>
       <w:tr>
-        <w:tblPrEx>
-          <w:tblCellMar>
-            <w:top w:w="0" w:type="dxa"/>
-            <w:bottom w:w="0" w:type="dxa"/>
-          </w:tblCellMar>
-        </w:tblPrEx>
         <w:tc>
           <w:tcPr>
             <w:tcW w:w="2040" w:type="dxa"/>
@@ -8079,12 +7665,6 @@
         </w:tc>
       </w:tr>
       <w:tr>
-        <w:tblPrEx>
-          <w:tblCellMar>
-            <w:top w:w="0" w:type="dxa"/>
-            <w:bottom w:w="0" w:type="dxa"/>
-          </w:tblCellMar>
-        </w:tblPrEx>
         <w:tc>
           <w:tcPr>
             <w:tcW w:w="2040" w:type="dxa"/>
@@ -8227,12 +7807,6 @@
         <w:gridCol w:w="4920"/>
       </w:tblGrid>
       <w:tr>
-        <w:tblPrEx>
-          <w:tblCellMar>
-            <w:top w:w="0" w:type="dxa"/>
-            <w:bottom w:w="0" w:type="dxa"/>
-          </w:tblCellMar>
-        </w:tblPrEx>
         <w:trPr>
           <w:tblHeader/>
         </w:trPr>
@@ -8328,12 +7902,6 @@
         </w:tc>
       </w:tr>
       <w:tr>
-        <w:tblPrEx>
-          <w:tblCellMar>
-            <w:top w:w="0" w:type="dxa"/>
-            <w:bottom w:w="0" w:type="dxa"/>
-          </w:tblCellMar>
-        </w:tblPrEx>
         <w:tc>
           <w:tcPr>
             <w:tcW w:w="2400" w:type="dxa"/>
@@ -8419,12 +7987,6 @@
         </w:tc>
       </w:tr>
       <w:tr>
-        <w:tblPrEx>
-          <w:tblCellMar>
-            <w:top w:w="0" w:type="dxa"/>
-            <w:bottom w:w="0" w:type="dxa"/>
-          </w:tblCellMar>
-        </w:tblPrEx>
         <w:tc>
           <w:tcPr>
             <w:tcW w:w="2400" w:type="dxa"/>
@@ -8510,12 +8072,6 @@
         </w:tc>
       </w:tr>
       <w:tr>
-        <w:tblPrEx>
-          <w:tblCellMar>
-            <w:top w:w="0" w:type="dxa"/>
-            <w:bottom w:w="0" w:type="dxa"/>
-          </w:tblCellMar>
-        </w:tblPrEx>
         <w:tc>
           <w:tcPr>
             <w:tcW w:w="2400" w:type="dxa"/>
@@ -8617,12 +8173,6 @@
         </w:tc>
       </w:tr>
       <w:tr>
-        <w:tblPrEx>
-          <w:tblCellMar>
-            <w:top w:w="0" w:type="dxa"/>
-            <w:bottom w:w="0" w:type="dxa"/>
-          </w:tblCellMar>
-        </w:tblPrEx>
         <w:tc>
           <w:tcPr>
             <w:tcW w:w="2400" w:type="dxa"/>
@@ -8706,12 +8256,6 @@
         </w:tc>
       </w:tr>
       <w:tr>
-        <w:tblPrEx>
-          <w:tblCellMar>
-            <w:top w:w="0" w:type="dxa"/>
-            <w:bottom w:w="0" w:type="dxa"/>
-          </w:tblCellMar>
-        </w:tblPrEx>
         <w:tc>
           <w:tcPr>
             <w:tcW w:w="2400" w:type="dxa"/>
@@ -8797,12 +8341,6 @@
         </w:tc>
       </w:tr>
       <w:tr>
-        <w:tblPrEx>
-          <w:tblCellMar>
-            <w:top w:w="0" w:type="dxa"/>
-            <w:bottom w:w="0" w:type="dxa"/>
-          </w:tblCellMar>
-        </w:tblPrEx>
         <w:tc>
           <w:tcPr>
             <w:tcW w:w="2400" w:type="dxa"/>
@@ -8897,12 +8435,6 @@
         </w:tc>
       </w:tr>
       <w:tr>
-        <w:tblPrEx>
-          <w:tblCellMar>
-            <w:top w:w="0" w:type="dxa"/>
-            <w:bottom w:w="0" w:type="dxa"/>
-          </w:tblCellMar>
-        </w:tblPrEx>
         <w:tc>
           <w:tcPr>
             <w:tcW w:w="2400" w:type="dxa"/>
@@ -8988,12 +8520,6 @@
         </w:tc>
       </w:tr>
       <w:tr>
-        <w:tblPrEx>
-          <w:tblCellMar>
-            <w:top w:w="0" w:type="dxa"/>
-            <w:bottom w:w="0" w:type="dxa"/>
-          </w:tblCellMar>
-        </w:tblPrEx>
         <w:tc>
           <w:tcPr>
             <w:tcW w:w="2400" w:type="dxa"/>
@@ -9079,12 +8605,6 @@
         </w:tc>
       </w:tr>
       <w:tr>
-        <w:tblPrEx>
-          <w:tblCellMar>
-            <w:top w:w="0" w:type="dxa"/>
-            <w:bottom w:w="0" w:type="dxa"/>
-          </w:tblCellMar>
-        </w:tblPrEx>
         <w:tc>
           <w:tcPr>
             <w:tcW w:w="2400" w:type="dxa"/>
@@ -9170,12 +8690,6 @@
         </w:tc>
       </w:tr>
       <w:tr>
-        <w:tblPrEx>
-          <w:tblCellMar>
-            <w:top w:w="0" w:type="dxa"/>
-            <w:bottom w:w="0" w:type="dxa"/>
-          </w:tblCellMar>
-        </w:tblPrEx>
         <w:tc>
           <w:tcPr>
             <w:tcW w:w="2400" w:type="dxa"/>
@@ -9262,12 +8776,6 @@
         </w:tc>
       </w:tr>
       <w:tr>
-        <w:tblPrEx>
-          <w:tblCellMar>
-            <w:top w:w="0" w:type="dxa"/>
-            <w:bottom w:w="0" w:type="dxa"/>
-          </w:tblCellMar>
-        </w:tblPrEx>
         <w:tc>
           <w:tcPr>
             <w:tcW w:w="2400" w:type="dxa"/>
@@ -9353,12 +8861,6 @@
         </w:tc>
       </w:tr>
       <w:tr>
-        <w:tblPrEx>
-          <w:tblCellMar>
-            <w:top w:w="0" w:type="dxa"/>
-            <w:bottom w:w="0" w:type="dxa"/>
-          </w:tblCellMar>
-        </w:tblPrEx>
         <w:tc>
           <w:tcPr>
             <w:tcW w:w="2400" w:type="dxa"/>
@@ -9444,12 +8946,6 @@
         </w:tc>
       </w:tr>
       <w:tr>
-        <w:tblPrEx>
-          <w:tblCellMar>
-            <w:top w:w="0" w:type="dxa"/>
-            <w:bottom w:w="0" w:type="dxa"/>
-          </w:tblCellMar>
-        </w:tblPrEx>
         <w:tc>
           <w:tcPr>
             <w:tcW w:w="2400" w:type="dxa"/>
@@ -9535,12 +9031,6 @@
         </w:tc>
       </w:tr>
       <w:tr>
-        <w:tblPrEx>
-          <w:tblCellMar>
-            <w:top w:w="0" w:type="dxa"/>
-            <w:bottom w:w="0" w:type="dxa"/>
-          </w:tblCellMar>
-        </w:tblPrEx>
         <w:tc>
           <w:tcPr>
             <w:tcW w:w="2400" w:type="dxa"/>
@@ -9626,12 +9116,6 @@
         </w:tc>
       </w:tr>
       <w:tr>
-        <w:tblPrEx>
-          <w:tblCellMar>
-            <w:top w:w="0" w:type="dxa"/>
-            <w:bottom w:w="0" w:type="dxa"/>
-          </w:tblCellMar>
-        </w:tblPrEx>
         <w:tc>
           <w:tcPr>
             <w:tcW w:w="2400" w:type="dxa"/>
@@ -9717,12 +9201,6 @@
         </w:tc>
       </w:tr>
       <w:tr>
-        <w:tblPrEx>
-          <w:tblCellMar>
-            <w:top w:w="0" w:type="dxa"/>
-            <w:bottom w:w="0" w:type="dxa"/>
-          </w:tblCellMar>
-        </w:tblPrEx>
         <w:tc>
           <w:tcPr>
             <w:tcW w:w="2400" w:type="dxa"/>
@@ -9824,12 +9302,6 @@
         </w:tc>
       </w:tr>
       <w:tr>
-        <w:tblPrEx>
-          <w:tblCellMar>
-            <w:top w:w="0" w:type="dxa"/>
-            <w:bottom w:w="0" w:type="dxa"/>
-          </w:tblCellMar>
-        </w:tblPrEx>
         <w:tc>
           <w:tcPr>
             <w:tcW w:w="2400" w:type="dxa"/>
@@ -9922,12 +9394,6 @@
         </w:tc>
       </w:tr>
       <w:tr>
-        <w:tblPrEx>
-          <w:tblCellMar>
-            <w:top w:w="0" w:type="dxa"/>
-            <w:bottom w:w="0" w:type="dxa"/>
-          </w:tblCellMar>
-        </w:tblPrEx>
         <w:tc>
           <w:tcPr>
             <w:tcW w:w="2400" w:type="dxa"/>
@@ -10011,12 +9477,6 @@
         </w:tc>
       </w:tr>
       <w:tr>
-        <w:tblPrEx>
-          <w:tblCellMar>
-            <w:top w:w="0" w:type="dxa"/>
-            <w:bottom w:w="0" w:type="dxa"/>
-          </w:tblCellMar>
-        </w:tblPrEx>
         <w:tc>
           <w:tcPr>
             <w:tcW w:w="2400" w:type="dxa"/>
@@ -10109,12 +9569,6 @@
         </w:tc>
       </w:tr>
       <w:tr>
-        <w:tblPrEx>
-          <w:tblCellMar>
-            <w:top w:w="0" w:type="dxa"/>
-            <w:bottom w:w="0" w:type="dxa"/>
-          </w:tblCellMar>
-        </w:tblPrEx>
         <w:tc>
           <w:tcPr>
             <w:tcW w:w="2400" w:type="dxa"/>
@@ -10207,12 +9661,6 @@
         </w:tc>
       </w:tr>
       <w:tr>
-        <w:tblPrEx>
-          <w:tblCellMar>
-            <w:top w:w="0" w:type="dxa"/>
-            <w:bottom w:w="0" w:type="dxa"/>
-          </w:tblCellMar>
-        </w:tblPrEx>
         <w:tc>
           <w:tcPr>
             <w:tcW w:w="2400" w:type="dxa"/>
@@ -11003,7 +10451,43 @@
         <w:sz w:val="18"/>
         <w:szCs w:val="18"/>
       </w:rPr>
-      <w:t xml:space="preserve">Wolf Golf Game — Official Rules  |  5-Player Mode  |  Page </w:t>
+      <w:t xml:space="preserve">Wolf Golf Game — Official </w:t>
+    </w:r>
+    <w:proofErr w:type="gramStart"/>
+    <w:r>
+      <w:rPr>
+        <w:color w:val="666666"/>
+        <w:sz w:val="18"/>
+        <w:szCs w:val="18"/>
+      </w:rPr>
+      <w:t>Rules  |</w:t>
+    </w:r>
+    <w:proofErr w:type="gramEnd"/>
+    <w:r>
+      <w:rPr>
+        <w:color w:val="666666"/>
+        <w:sz w:val="18"/>
+        <w:szCs w:val="18"/>
+      </w:rPr>
+      <w:t xml:space="preserve">  5-Player </w:t>
+    </w:r>
+    <w:proofErr w:type="gramStart"/>
+    <w:r>
+      <w:rPr>
+        <w:color w:val="666666"/>
+        <w:sz w:val="18"/>
+        <w:szCs w:val="18"/>
+      </w:rPr>
+      <w:t>Mode  |</w:t>
+    </w:r>
+    <w:proofErr w:type="gramEnd"/>
+    <w:r>
+      <w:rPr>
+        <w:color w:val="666666"/>
+        <w:sz w:val="18"/>
+        <w:szCs w:val="18"/>
+      </w:rPr>
+      <w:t xml:space="preserve">  Page </w:t>
     </w:r>
     <w:r>
       <w:rPr>

</xml_diff>